<commit_message>
feat: update project documentation and add maintenance proposal for CAT Apps
- Revised the project report to reflect updated dates and project timelines, ensuring accuracy in documentation.
- Introduced a new maintenance and technical support proposal for CAT Apps, detailing service offerings, contract value, and service scope for annual support.
- Added new images to enhance visual representation in the application, including logos and member photos, improving branding consistency.
- Made minor UI adjustments in various components to enhance user experience and visual appeal.
</commit_message>
<xml_diff>
--- a/docs/Laporan-Pertanggungjawaban-CAT-Apps.docx
+++ b/docs/Laporan-Pertanggungjawaban-CAT-Apps.docx
@@ -103,7 +103,19 @@
         <w:rPr>
           <w:rFonts w:ascii="Times New Roman" w:hAnsi="Times New Roman" w:cs="Times New Roman"/>
         </w:rPr>
-        <w:t xml:space="preserve"> 8 Juli 2026</w:t>
+        <w:t xml:space="preserve"> </w:t>
+      </w:r>
+      <w:r>
+        <w:rPr>
+          <w:rFonts w:ascii="Times New Roman" w:hAnsi="Times New Roman" w:cs="Times New Roman"/>
+        </w:rPr>
+        <w:t>15</w:t>
+      </w:r>
+      <w:r>
+        <w:rPr>
+          <w:rFonts w:ascii="Times New Roman" w:hAnsi="Times New Roman" w:cs="Times New Roman"/>
+        </w:rPr>
+        <w:t xml:space="preserve"> Juli 2026</w:t>
       </w:r>
       <w:r>
         <w:rPr>
@@ -139,7 +151,31 @@
         <w:rPr>
           <w:rFonts w:ascii="Times New Roman" w:hAnsi="Times New Roman" w:cs="Times New Roman"/>
         </w:rPr>
-        <w:t xml:space="preserve"> 4 Mei 2026 – 31 Mei 2026</w:t>
+        <w:t xml:space="preserve"> 4 Mei 2026 – </w:t>
+      </w:r>
+      <w:r>
+        <w:rPr>
+          <w:rFonts w:ascii="Times New Roman" w:hAnsi="Times New Roman" w:cs="Times New Roman"/>
+        </w:rPr>
+        <w:t>15</w:t>
+      </w:r>
+      <w:r>
+        <w:rPr>
+          <w:rFonts w:ascii="Times New Roman" w:hAnsi="Times New Roman" w:cs="Times New Roman"/>
+        </w:rPr>
+        <w:t xml:space="preserve"> </w:t>
+      </w:r>
+      <w:r>
+        <w:rPr>
+          <w:rFonts w:ascii="Times New Roman" w:hAnsi="Times New Roman" w:cs="Times New Roman"/>
+        </w:rPr>
+        <w:t>Juli</w:t>
+      </w:r>
+      <w:r>
+        <w:rPr>
+          <w:rFonts w:ascii="Times New Roman" w:hAnsi="Times New Roman" w:cs="Times New Roman"/>
+        </w:rPr>
+        <w:t xml:space="preserve"> 2026</w:t>
       </w:r>
       <w:r>
         <w:rPr>
@@ -443,13 +479,7 @@
               <w:rPr>
                 <w:rFonts w:ascii="Times New Roman" w:hAnsi="Times New Roman" w:cs="Times New Roman"/>
               </w:rPr>
-              <w:t>BJP. (P) Drs. H. Awang Anwarudin, M</w:t>
-            </w:r>
-            <w:r>
-              <w:rPr>
-                <w:rFonts w:ascii="Times New Roman" w:hAnsi="Times New Roman" w:cs="Times New Roman"/>
-              </w:rPr>
-              <w:t>.H.</w:t>
+              <w:t>BJP. (P) Drs. H. Awang Anwarudin, M.H.</w:t>
             </w:r>
           </w:p>
         </w:tc>
@@ -575,13 +605,7 @@
         <w:rPr>
           <w:rFonts w:ascii="Times New Roman" w:hAnsi="Times New Roman" w:cs="Times New Roman"/>
         </w:rPr>
-        <w:t>PIHAK PERTAMA telah meny</w:t>
-      </w:r>
-      <w:r>
-        <w:rPr>
-          <w:rFonts w:ascii="Times New Roman" w:hAnsi="Times New Roman" w:cs="Times New Roman"/>
-        </w:rPr>
-        <w:t xml:space="preserve">elesaikan pengembangan aplikasi </w:t>
+        <w:t xml:space="preserve">PIHAK PERTAMA telah menyelesaikan pengembangan aplikasi </w:t>
       </w:r>
       <w:r>
         <w:rPr>
@@ -609,13 +633,7 @@
         <w:rPr>
           <w:rFonts w:ascii="Times New Roman" w:hAnsi="Times New Roman" w:cs="Times New Roman"/>
         </w:rPr>
-        <w:t>Aplikasi telah di-deploy ke server produksi, dapat diakses publ</w:t>
-      </w:r>
-      <w:r>
-        <w:rPr>
-          <w:rFonts w:ascii="Times New Roman" w:hAnsi="Times New Roman" w:cs="Times New Roman"/>
-        </w:rPr>
-        <w:t>ik, dan beroperasi dengan arsitektur modern (Laravel 12 + Vue 3) yang mendukung operasional bimbel online maupun pendukung proses offline.</w:t>
+        <w:t>Aplikasi telah di-deploy ke server produksi, dapat diakses publik, dan beroperasi dengan arsitektur modern (Laravel 12 + Vue 3) yang mendukung operasional bimbel online maupun pendukung proses offline.</w:t>
       </w:r>
     </w:p>
     <w:p>
@@ -786,13 +804,7 @@
               <w:rPr>
                 <w:rFonts w:ascii="Times New Roman" w:hAnsi="Times New Roman" w:cs="Times New Roman"/>
               </w:rPr>
-              <w:t>Seles</w:t>
-            </w:r>
-            <w:r>
-              <w:rPr>
-                <w:rFonts w:ascii="Times New Roman" w:hAnsi="Times New Roman" w:cs="Times New Roman"/>
-              </w:rPr>
-              <w:t>ai</w:t>
+              <w:t>Selesai</w:t>
             </w:r>
           </w:p>
         </w:tc>
@@ -1768,13 +1780,7 @@
           <w:rFonts w:ascii="Times New Roman" w:hAnsi="Times New Roman" w:cs="Times New Roman"/>
         </w:rPr>
         <w:lastRenderedPageBreak/>
-        <w:t>Modul ma</w:t>
-      </w:r>
-      <w:r>
-        <w:rPr>
-          <w:rFonts w:ascii="Times New Roman" w:hAnsi="Times New Roman" w:cs="Times New Roman"/>
-        </w:rPr>
-        <w:t>najemen soal memungkinkan Admin dan Mentor untuk:</w:t>
+        <w:t>Modul manajemen soal memungkinkan Admin dan Mentor untuk:</w:t>
       </w:r>
     </w:p>
     <w:p>
@@ -1846,13 +1852,7 @@
         <w:rPr>
           <w:rFonts w:ascii="Times New Roman" w:hAnsi="Times New Roman" w:cs="Times New Roman"/>
         </w:rPr>
-        <w:t>Mengunggah gamba</w:t>
-      </w:r>
-      <w:r>
-        <w:rPr>
-          <w:rFonts w:ascii="Times New Roman" w:hAnsi="Times New Roman" w:cs="Times New Roman"/>
-        </w:rPr>
-        <w:t>r pendukung soal</w:t>
+        <w:t>Mengunggah gambar pendukung soal</w:t>
       </w:r>
     </w:p>
     <w:p>
@@ -2300,13 +2300,7 @@
         <w:rPr>
           <w:rFonts w:ascii="Times New Roman" w:hAnsi="Times New Roman" w:cs="Times New Roman"/>
         </w:rPr>
-        <w:t>Kunci jawaban disembunyikan sa</w:t>
-      </w:r>
-      <w:r>
-        <w:rPr>
-          <w:rFonts w:ascii="Times New Roman" w:hAnsi="Times New Roman" w:cs="Times New Roman"/>
-        </w:rPr>
-        <w:t>at ujian berlangsung</w:t>
+        <w:t>Kunci jawaban disembunyikan saat ujian berlangsung</w:t>
       </w:r>
     </w:p>
     <w:p>
@@ -2531,13 +2525,7 @@
               <w:rPr>
                 <w:rFonts w:ascii="Times New Roman" w:hAnsi="Times New Roman" w:cs="Times New Roman"/>
               </w:rPr>
-              <w:t>Verifikasi email → Pembayaran → Konfirma</w:t>
-            </w:r>
-            <w:r>
-              <w:rPr>
-                <w:rFonts w:ascii="Times New Roman" w:hAnsi="Times New Roman" w:cs="Times New Roman"/>
-              </w:rPr>
-              <w:t>si admin</w:t>
+              <w:t>Verifikasi email → Pembayaran → Konfirmasi admin</w:t>
             </w:r>
           </w:p>
         </w:tc>
@@ -2859,13 +2847,7 @@
         <w:rPr>
           <w:rFonts w:ascii="Times New Roman" w:hAnsi="Times New Roman" w:cs="Times New Roman"/>
         </w:rPr>
-        <w:t>Peserta mengisi data singkat (nam</w:t>
-      </w:r>
-      <w:r>
-        <w:rPr>
-          <w:rFonts w:ascii="Times New Roman" w:hAnsi="Times New Roman" w:cs="Times New Roman"/>
-        </w:rPr>
-        <w:t>a, jenis kelamin, kota, tanggal lahir, telepon)</w:t>
+        <w:t>Peserta mengisi data singkat (nama, jenis kelamin, kota, tanggal lahir, telepon)</w:t>
       </w:r>
     </w:p>
     <w:p>
@@ -2995,15 +2977,7 @@
           <w:b/>
           <w:bCs/>
         </w:rPr>
-        <w:t>Status: SEL</w:t>
-      </w:r>
-      <w:r>
-        <w:rPr>
-          <w:rFonts w:ascii="Times New Roman" w:hAnsi="Times New Roman" w:cs="Times New Roman"/>
-          <w:b/>
-          <w:bCs/>
-        </w:rPr>
-        <w:t>ESAI</w:t>
+        <w:t>Status: SELESAI</w:t>
       </w:r>
     </w:p>
     <w:tbl>
@@ -3327,13 +3301,7 @@
               <w:rPr>
                 <w:rFonts w:ascii="Times New Roman" w:hAnsi="Times New Roman" w:cs="Times New Roman"/>
               </w:rPr>
-              <w:t>Isi Dash</w:t>
-            </w:r>
-            <w:r>
-              <w:rPr>
-                <w:rFonts w:ascii="Times New Roman" w:hAnsi="Times New Roman" w:cs="Times New Roman"/>
-              </w:rPr>
-              <w:t>board</w:t>
+              <w:t>Isi Dashboard</w:t>
             </w:r>
           </w:p>
         </w:tc>
@@ -3802,13 +3770,7 @@
               <w:rPr>
                 <w:rFonts w:ascii="Times New Roman" w:hAnsi="Times New Roman" w:cs="Times New Roman"/>
               </w:rPr>
-              <w:t>Tahap psikologi, kesehatan, dan fisik diverifikasi di lokasi tes; staff memperbarui status via admin; input nilai jasmani manual di Manajemen Ni</w:t>
-            </w:r>
-            <w:r>
-              <w:rPr>
-                <w:rFonts w:ascii="Times New Roman" w:hAnsi="Times New Roman" w:cs="Times New Roman"/>
-              </w:rPr>
-              <w:t>lai</w:t>
+              <w:t>Tahap psikologi, kesehatan, dan fisik diverifikasi di lokasi tes; staff memperbarui status via admin; input nilai jasmani manual di Manajemen Nilai</w:t>
             </w:r>
           </w:p>
         </w:tc>
@@ -3909,13 +3871,7 @@
         <w:rPr>
           <w:rFonts w:ascii="Times New Roman" w:hAnsi="Times New Roman" w:cs="Times New Roman"/>
         </w:rPr>
-        <w:t>CRUD penggun</w:t>
-      </w:r>
-      <w:r>
-        <w:rPr>
-          <w:rFonts w:ascii="Times New Roman" w:hAnsi="Times New Roman" w:cs="Times New Roman"/>
-        </w:rPr>
-        <w:t>a dengan role: Admin, Mentor, Peserta, Orang Tua</w:t>
+        <w:t>CRUD pengguna dengan role: Admin, Mentor, Peserta, Orang Tua</w:t>
       </w:r>
     </w:p>
     <w:p>
@@ -4265,13 +4221,7 @@
               <w:rPr>
                 <w:rFonts w:ascii="Times New Roman" w:hAnsi="Times New Roman" w:cs="Times New Roman"/>
               </w:rPr>
-              <w:t>3 bulan (sejak ko</w:t>
-            </w:r>
-            <w:r>
-              <w:rPr>
-                <w:rFonts w:ascii="Times New Roman" w:hAnsi="Times New Roman" w:cs="Times New Roman"/>
-              </w:rPr>
-              <w:t>nfirmasi pembayaran)</w:t>
+              <w:t>3 bulan (sejak konfirmasi pembayaran)</w:t>
             </w:r>
           </w:p>
         </w:tc>
@@ -4527,15 +4477,7 @@
           <w:b/>
           <w:bCs/>
         </w:rPr>
-        <w:t>Status: SELESAI (f</w:t>
-      </w:r>
-      <w:r>
-        <w:rPr>
-          <w:rFonts w:ascii="Times New Roman" w:hAnsi="Times New Roman" w:cs="Times New Roman"/>
-          <w:b/>
-          <w:bCs/>
-        </w:rPr>
-        <w:t>ungsi inti)</w:t>
+        <w:t>Status: SELESAI (fungsi inti)</w:t>
       </w:r>
     </w:p>
     <w:p>
@@ -4877,13 +4819,7 @@
               <w:rPr>
                 <w:rFonts w:ascii="Times New Roman" w:hAnsi="Times New Roman" w:cs="Times New Roman"/>
               </w:rPr>
-              <w:t>Monitoring pendafta</w:t>
-            </w:r>
-            <w:r>
-              <w:rPr>
-                <w:rFonts w:ascii="Times New Roman" w:hAnsi="Times New Roman" w:cs="Times New Roman"/>
-              </w:rPr>
-              <w:t>ran</w:t>
+              <w:t>Monitoring pendaftaran</w:t>
             </w:r>
           </w:p>
         </w:tc>
@@ -5033,17 +4969,7 @@
           <w:sz w:val="24"/>
           <w:szCs w:val="24"/>
         </w:rPr>
-        <w:t>12.</w:t>
-      </w:r>
-      <w:r>
-        <w:rPr>
-          <w:rFonts w:ascii="Times New Roman" w:hAnsi="Times New Roman" w:cs="Times New Roman"/>
-          <w:b/>
-          <w:bCs/>
-          <w:sz w:val="24"/>
-          <w:szCs w:val="24"/>
-        </w:rPr>
-        <w:t xml:space="preserve"> Email Server dan Cloud Server (1 Tahun)</w:t>
+        <w:t>12. Email Server dan Cloud Server (1 Tahun)</w:t>
       </w:r>
     </w:p>
     <w:p>
@@ -5152,73 +5078,7 @@
               <w:rPr>
                 <w:rFonts w:ascii="Times New Roman" w:hAnsi="Times New Roman" w:cs="Times New Roman"/>
               </w:rPr>
-              <w:t>L</w:t>
-            </w:r>
-            <w:r>
-              <w:rPr>
-                <w:rFonts w:ascii="Times New Roman" w:hAnsi="Times New Roman" w:cs="Times New Roman"/>
-              </w:rPr>
-              <w:t>a</w:t>
-            </w:r>
-            <w:r>
-              <w:rPr>
-                <w:rFonts w:ascii="Times New Roman" w:hAnsi="Times New Roman" w:cs="Times New Roman"/>
-              </w:rPr>
-              <w:t>r</w:t>
-            </w:r>
-            <w:r>
-              <w:rPr>
-                <w:rFonts w:ascii="Times New Roman" w:hAnsi="Times New Roman" w:cs="Times New Roman"/>
-              </w:rPr>
-              <w:t>a</w:t>
-            </w:r>
-            <w:r>
-              <w:rPr>
-                <w:rFonts w:ascii="Times New Roman" w:hAnsi="Times New Roman" w:cs="Times New Roman"/>
-              </w:rPr>
-              <w:t>v</w:t>
-            </w:r>
-            <w:r>
-              <w:rPr>
-                <w:rFonts w:ascii="Times New Roman" w:hAnsi="Times New Roman" w:cs="Times New Roman"/>
-              </w:rPr>
-              <w:t>e</w:t>
-            </w:r>
-            <w:r>
-              <w:rPr>
-                <w:rFonts w:ascii="Times New Roman" w:hAnsi="Times New Roman" w:cs="Times New Roman"/>
-              </w:rPr>
-              <w:t>l</w:t>
-            </w:r>
-            <w:r>
-              <w:rPr>
-                <w:rFonts w:ascii="Times New Roman" w:hAnsi="Times New Roman" w:cs="Times New Roman"/>
-              </w:rPr>
-              <w:t xml:space="preserve"> </w:t>
-            </w:r>
-            <w:r>
-              <w:rPr>
-                <w:rFonts w:ascii="Times New Roman" w:hAnsi="Times New Roman" w:cs="Times New Roman"/>
-              </w:rPr>
-              <w:t>M</w:t>
-            </w:r>
-            <w:r>
-              <w:rPr>
-                <w:rFonts w:ascii="Times New Roman" w:hAnsi="Times New Roman" w:cs="Times New Roman"/>
-              </w:rPr>
-              <w:t>a</w:t>
-            </w:r>
-            <w:r>
-              <w:rPr>
-                <w:rFonts w:ascii="Times New Roman" w:hAnsi="Times New Roman" w:cs="Times New Roman"/>
-              </w:rPr>
-              <w:t>i</w:t>
-            </w:r>
-            <w:r>
-              <w:rPr>
-                <w:rFonts w:ascii="Times New Roman" w:hAnsi="Times New Roman" w:cs="Times New Roman"/>
-              </w:rPr>
-              <w:t>l</w:t>
+              <w:t>Laravel Mail</w:t>
             </w:r>
             <w:r>
               <w:rPr>
@@ -5377,15 +5237,7 @@
           <w:b/>
           <w:bCs/>
         </w:rPr>
-        <w:t>Website</w:t>
-      </w:r>
-      <w:r>
-        <w:rPr>
-          <w:rFonts w:ascii="Times New Roman" w:hAnsi="Times New Roman" w:cs="Times New Roman"/>
-          <w:b/>
-          <w:bCs/>
-        </w:rPr>
-        <w:t xml:space="preserve"> produksi:</w:t>
+        <w:t>Website produksi:</w:t>
       </w:r>
       <w:r>
         <w:rPr>
@@ -5683,13 +5535,7 @@
               <w:rPr>
                 <w:rFonts w:ascii="Times New Roman" w:hAnsi="Times New Roman" w:cs="Times New Roman"/>
               </w:rPr>
-              <w:t>Aplikasi dapat</w:t>
-            </w:r>
-            <w:r>
-              <w:rPr>
-                <w:rFonts w:ascii="Times New Roman" w:hAnsi="Times New Roman" w:cs="Times New Roman"/>
-              </w:rPr>
-              <w:t xml:space="preserve"> di-install di perangkat mobile</w:t>
+              <w:t>Aplikasi dapat di-install di perangkat mobile</w:t>
             </w:r>
           </w:p>
         </w:tc>
@@ -7336,13 +7182,7 @@
         <w:rPr>
           <w:rFonts w:ascii="Times New Roman" w:hAnsi="Times New Roman" w:cs="Times New Roman"/>
         </w:rPr>
-        <w:t>Mod</w:t>
-      </w:r>
-      <w:r>
-        <w:rPr>
-          <w:rFonts w:ascii="Times New Roman" w:hAnsi="Times New Roman" w:cs="Times New Roman"/>
-        </w:rPr>
-        <w:t>ul offline mengacu pada alur operasional tes di lokasi fisik, bukan mode ujian tanpa jaringan di perangkat peserta.</w:t>
+        <w:t>Modul offline mengacu pada alur operasional tes di lokasi fisik, bukan mode ujian tanpa jaringan di perangkat peserta.</w:t>
       </w:r>
     </w:p>
     <w:p>
@@ -7378,13 +7218,7 @@
         <w:rPr>
           <w:rFonts w:ascii="Times New Roman" w:hAnsi="Times New Roman" w:cs="Times New Roman"/>
         </w:rPr>
-        <w:t>Revisi mengacu Pasal 5: maksimal 5 kali revisi; d</w:t>
-      </w:r>
-      <w:r>
-        <w:rPr>
-          <w:rFonts w:ascii="Times New Roman" w:hAnsi="Times New Roman" w:cs="Times New Roman"/>
-        </w:rPr>
-        <w:t>i luar itu biaya tambahan.</w:t>
+        <w:t>Revisi mengacu Pasal 5: maksimal 5 kali revisi; di luar itu biaya tambahan.</w:t>
       </w:r>
     </w:p>
     <w:p>
@@ -7436,13 +7270,7 @@
         <w:rPr>
           <w:rFonts w:ascii="Times New Roman" w:hAnsi="Times New Roman" w:cs="Times New Roman"/>
         </w:rPr>
-        <w:t xml:space="preserve"> sesuai ruang lingkup Perjanjian Kerja Sama tertangg</w:t>
-      </w:r>
-      <w:r>
-        <w:rPr>
-          <w:rFonts w:ascii="Times New Roman" w:hAnsi="Times New Roman" w:cs="Times New Roman"/>
-        </w:rPr>
-        <w:t>al 4 Mei 2026.</w:t>
+        <w:t xml:space="preserve"> sesuai ruang lingkup Perjanjian Kerja Sama tertanggal 4 Mei 2026.</w:t>
       </w:r>
       <w:r>
         <w:rPr>
@@ -7493,7 +7321,7 @@
           <w:b/>
           <w:bCs/>
         </w:rPr>
-        <w:t>Bandung, 8 Juli 20</w:t>
+        <w:t xml:space="preserve">Bandung, </w:t>
       </w:r>
       <w:r>
         <w:rPr>
@@ -7501,7 +7329,17 @@
           <w:b/>
           <w:bCs/>
         </w:rPr>
-        <w:t>26</w:t>
+        <w:t>15</w:t>
+      </w:r>
+      <w:bookmarkStart w:id="29" w:name="_GoBack"/>
+      <w:bookmarkEnd w:id="29"/>
+      <w:r>
+        <w:rPr>
+          <w:rFonts w:ascii="Times New Roman" w:hAnsi="Times New Roman" w:cs="Times New Roman"/>
+          <w:b/>
+          <w:bCs/>
+        </w:rPr>
+        <w:t xml:space="preserve"> Juli 2026</w:t>
       </w:r>
     </w:p>
     <w:tbl>
@@ -7687,18 +7525,16 @@
           </w:p>
         </w:tc>
       </w:tr>
-    </w:tbl>
-    <w:p>
-      <w:pPr>
-        <w:pStyle w:val="BodyText"/>
-        <w:rPr>
-          <w:rFonts w:ascii="Times New Roman" w:hAnsi="Times New Roman" w:cs="Times New Roman"/>
-        </w:rPr>
-      </w:pPr>
-      <w:bookmarkStart w:id="29" w:name="_GoBack"/>
       <w:bookmarkEnd w:id="0"/>
       <w:bookmarkEnd w:id="28"/>
-      <w:bookmarkEnd w:id="29"/>
+    </w:tbl>
+    <w:p>
+      <w:pPr>
+        <w:pStyle w:val="BodyText"/>
+        <w:rPr>
+          <w:rFonts w:ascii="Times New Roman" w:hAnsi="Times New Roman" w:cs="Times New Roman"/>
+        </w:rPr>
+      </w:pPr>
     </w:p>
     <w:sectPr>
       <w:footnotePr>
@@ -8202,6 +8038,13 @@
     <w:lsdException w:name="Placeholder Text" w:semiHidden="1"/>
     <w:lsdException w:name="Light Shading"/>
     <w:lsdException w:name="Light List"/>
+    <w:lsdException w:name="Light Grid"/>
+    <w:lsdException w:name="Medium Shading 1"/>
+    <w:lsdException w:name="Medium Shading 2"/>
+    <w:lsdException w:name="Medium List 1"/>
+    <w:lsdException w:name="Medium List 2"/>
+    <w:lsdException w:name="Medium Grid 1"/>
+    <w:lsdException w:name="Medium Grid 2"/>
     <w:lsdException w:name="Medium Grid 3"/>
     <w:lsdException w:name="Dark List"/>
     <w:lsdException w:name="Colorful Shading"/>

</xml_diff>

<commit_message>
feat: enhance academic ranking features with manual entry support
- Implemented manual academic entries for students, allowing for offline assessments to be recorded alongside automated quiz scores.
- Updated the ProgressController to integrate manual entries into academic subject timelines and quiz results, improving data accuracy and reporting.
- Enhanced the RankingController to validate and process manual entries, including new assessment name requirements for academic groups.
- Added UI components in RankingManualModal for entering assessment names, improving user experience during manual score submissions.
- Updated localization messages to support new features and provide clearer guidance for users on manual entry processes.
</commit_message>
<xml_diff>
--- a/docs/Laporan-Pertanggungjawaban-CAT-Apps.docx
+++ b/docs/Laporan-Pertanggungjawaban-CAT-Apps.docx
@@ -109,7 +109,7 @@
         <w:rPr>
           <w:rFonts w:ascii="Times New Roman" w:hAnsi="Times New Roman" w:cs="Times New Roman"/>
         </w:rPr>
-        <w:t>15</w:t>
+        <w:t>21</w:t>
       </w:r>
       <w:r>
         <w:rPr>
@@ -157,7 +157,7 @@
         <w:rPr>
           <w:rFonts w:ascii="Times New Roman" w:hAnsi="Times New Roman" w:cs="Times New Roman"/>
         </w:rPr>
-        <w:t>15</w:t>
+        <w:t>21</w:t>
       </w:r>
       <w:r>
         <w:rPr>
@@ -7315,6 +7315,7 @@
           <w:rFonts w:ascii="Times New Roman" w:hAnsi="Times New Roman" w:cs="Times New Roman"/>
         </w:rPr>
       </w:pPr>
+      <w:bookmarkStart w:id="29" w:name="_GoBack"/>
       <w:r>
         <w:rPr>
           <w:rFonts w:ascii="Times New Roman" w:hAnsi="Times New Roman" w:cs="Times New Roman"/>
@@ -7329,10 +7330,8 @@
           <w:b/>
           <w:bCs/>
         </w:rPr>
-        <w:t>15</w:t>
-      </w:r>
-      <w:bookmarkStart w:id="29" w:name="_GoBack"/>
-      <w:bookmarkEnd w:id="29"/>
+        <w:t>21</w:t>
+      </w:r>
       <w:r>
         <w:rPr>
           <w:rFonts w:ascii="Times New Roman" w:hAnsi="Times New Roman" w:cs="Times New Roman"/>
@@ -7368,6 +7367,7 @@
           <w:tcPr>
             <w:tcW w:w="4788" w:type="dxa"/>
           </w:tcPr>
+          <w:bookmarkEnd w:id="29"/>
           <w:p>
             <w:pPr>
               <w:pStyle w:val="BodyText"/>

</xml_diff>